<commit_message>
update benchmark scoring and case inputs
</commit_message>
<xml_diff>
--- a/cases/data_selection/data_selection_006/env/curatorial_brief.docx
+++ b/cases/data_selection/data_selection_006/env/curatorial_brief.docx
@@ -10,16 +10,7 @@
       <w:r>
         <w:t>Working Waterfront</w:t>
         <w:br/>
-        <w:t>Feature Object Selection Brief</w:t>
-      </w:r>
-    </w:p>
-    <w:p>
-      <w:pPr>
-        <w:pStyle w:val="Subtitle"/>
-        <w:jc w:val="center"/>
-      </w:pPr>
-      <w:r>
-        <w:t>Spring 2027 Community History Exhibition</w:t>
+        <w:t>Feature Object Selection and Publication Brief</w:t>
       </w:r>
     </w:p>
     <w:p>
@@ -30,7 +21,19 @@
         <w:rPr>
           <w:b/>
         </w:rPr>
-        <w:t>Controlled review date: 18 February 2027, 4:00 PM</w:t>
+        <w:t>Spring 2027 Community History Exhibition</w:t>
+      </w:r>
+      <w:r>
+        <w:br/>
+        <w:t>Base-record cutoff: 18 February 2027, 4:00 PM</w:t>
+      </w:r>
+      <w:r>
+        <w:br/>
+        <w:t>Program-overlay cutoff: 20 February 2027, 5:00 PM</w:t>
+      </w:r>
+      <w:r>
+        <w:br/>
+        <w:t>Public-copy freeze: 25 February 2027, 12:00 PM</w:t>
       </w:r>
     </w:p>
     <w:p>
@@ -43,12 +46,7 @@
     </w:p>
     <w:p>
       <w:r>
-        <w:t>Prepare one public museum feature panel for the Working Waterfront exhibition. The workbooks are operational records from Collections, Curatorial, Interpretation, Loans, Rights, Conservation, and Exhibition Production. The public panel must be based on the final feasible selection, not merely the highest initial scores.</w:t>
-      </w:r>
-    </w:p>
-    <w:p>
-      <w:r>
-        <w:t>The exhibition runs from 20 March through 15 August 2027, inclusive. Public campaign rights must begin no later than 25 February 2027.</w:t>
+        <w:t>Prepare one public-facing museum feature panel from the final seven-object selection. The four original workbooks establish individual eligibility, eligible ranking, the provisional set, and the ordered operational feasibility reviews. public_program_freeze.xlsx then applies the approved community-program overlay, active placement and route-capacity overrides, phase definitions, and the frozen public copy. The operational seven-object set is not the publishable final set.</w:t>
       </w:r>
     </w:p>
     <w:p>
@@ -56,22 +54,37 @@
         <w:pStyle w:val="Heading1"/>
       </w:pPr>
       <w:r>
-        <w:t>1. Resolve the controlling records</w:t>
+        <w:t>1. Resolve controlling records at the correct cutoff</w:t>
       </w:r>
     </w:p>
     <w:p>
+      <w:pPr/>
       <w:r>
-        <w:t>For every accession number and every versioned sheet, ignore records timestamped after 18 February 2027 at 4:00 PM.</w:t>
+        <w:t>For Curatorial Reviews, Interpretation Reviews, Loan and Insurance, Rights and Credits, Conservation Assessments, Rotation Approvals, and Placement Requests, ignore rows after 18 February 2027 at 4:00 PM.</w:t>
       </w:r>
     </w:p>
     <w:p>
+      <w:pPr/>
       <w:r>
-        <w:t>Within each sheet, choose the record with the latest timestamp on or before the cutoff. When two records share the same timestamp, the larger revision_no controls. Never combine an older favorable field with a newer unfavorable record.</w:t>
+        <w:t>For Coverage Directives, Community Commitments, Placement Overrides, Route Capacity Overrides, and Phase Definitions, ignore rows after 20 February 2027 at 5:00 PM.</w:t>
       </w:r>
     </w:p>
     <w:p>
+      <w:pPr/>
       <w:r>
-        <w:t>Apply this rule separately to Curatorial Reviews, Interpretation Reviews, Loan and Insurance, Rights and Credits, Conservation Assessments, Rotation Approvals, and Placement Requests.</w:t>
+        <w:t>For Public Copy Freeze, ignore rows at or after 25 February 2027 at 12:00 PM; the latest row strictly before the freeze controls.</w:t>
+      </w:r>
+    </w:p>
+    <w:p>
+      <w:pPr/>
+      <w:r>
+        <w:t>Within each sheet and key, choose the latest permitted timestamp. When timestamps are equal, the larger revision_no controls. Use the controlling row as a whole; never combine fields from older revisions.</w:t>
+      </w:r>
+    </w:p>
+    <w:p>
+      <w:pPr/>
+      <w:r>
+        <w:t>An approved active placement override supersedes the controlling Placement Request for feasibility and public gallery/zone. An approved active route-capacity override supersedes only the matching gallery limits.</w:t>
       </w:r>
     </w:p>
     <w:p>
@@ -79,12 +92,124 @@
         <w:pStyle w:val="Heading1"/>
       </w:pPr>
       <w:r>
-        <w:t>2. Individual eligibility</w:t>
+        <w:t>2. Base individual eligibility and eligible ranking</w:t>
       </w:r>
     </w:p>
     <w:p>
       <w:r>
-        <w:t>An object is individually eligible only when every condition below is satisfied:</w:t>
+        <w:t>Apply the same individual-eligibility tests used in the original case: active object; fully approved final curatorial, interpretation, loan, rights, conservation, rotation, and placement records; all score thresholds; feature-specific audio/transcript/tactile approvals; complete loan, insurance, and rights windows; completed treatment and mount; sufficient display days; and a compatible open zone.</w:t>
+      </w:r>
+    </w:p>
+    <w:p>
+      <w:r>
+        <w:t>Curatorial score = 30% community relevance + 25% narrative strength + 20% provenance confidence + 15% visual impact + 10% accessibility value.</w:t>
+      </w:r>
+    </w:p>
+    <w:p>
+      <w:r>
+        <w:t>Rank individually eligible objects by: score descending; community relevance descending; installation crew-minutes (install_minutes × required_crew) ascending; accession number ascending.</w:t>
+      </w:r>
+    </w:p>
+    <w:p>
+      <w:pPr>
+        <w:pStyle w:val="Heading1"/>
+      </w:pPr>
+      <w:r>
+        <w:t>3. Build and operationally validate the first seven</w:t>
+      </w:r>
+    </w:p>
+    <w:p>
+      <w:r>
+        <w:t>Build the provisional seven exactly as before: take the highest-ranked eligible object for each of the five required themes, then scan the eligible ranking to fill seven while meeting the base collection, gallery, object-type, and accessibility rules.</w:t>
+      </w:r>
+    </w:p>
+    <w:p>
+      <w:r>
+        <w:t>Apply the four original feasibility reviews in order: zone slot counts; case inventory; confirmed installation crew-minute capacity; visitor-route feature/audio/tactile limits.</w:t>
+      </w:r>
+    </w:p>
+    <w:p>
+      <w:r>
+        <w:t>Use the established replacement rule after each conflict and continue until seven operationally feasible objects remain. Do not publish this intermediate set.</w:t>
+      </w:r>
+    </w:p>
+    <w:p>
+      <w:pPr>
+        <w:pStyle w:val="Heading1"/>
+      </w:pPr>
+      <w:r>
+        <w:t>4. Apply the approved program overlay</w:t>
+      </w:r>
+    </w:p>
+    <w:p>
+      <w:r>
+        <w:t>Resolve the controlling approved Coverage Directive. Its exact theme counts, collection/gallery caps, object-type minimum, accessibility totals, and full-run/limited-run totals are hard final-set constraints.</w:t>
+      </w:r>
+    </w:p>
+    <w:p>
+      <w:r>
+        <w:t>Resolve Community Commitments by accession. Every controlling commitment that is active, Tier A, approved_for_feature=yes, covers the full exhibition, and belongs to an individually eligible object is a mandatory program anchor.</w:t>
+      </w:r>
+    </w:p>
+    <w:p>
+      <w:r>
+        <w:t>Starting from the operational seven, insert missing mandatory anchors in eligible-rank order.</w:t>
+      </w:r>
+    </w:p>
+    <w:p>
+      <w:r>
+        <w:t>After each insertion, return the set to seven by removing the lowest-ranked non-mandatory object from a theme currently above its controlling target. If more than one such object is tied for removal, remove the one with greater crew-minutes, then the lexicographically larger accession number.</w:t>
+      </w:r>
+    </w:p>
+    <w:p>
+      <w:r>
+        <w:t>After all mandatory anchors are inserted, fill any theme deficit by scanning the eligible ranking. Recheck every directive constraint plus zone, case, crew, route, phase-visibility, and override feasibility after every change. Removed objects may not return.</w:t>
+      </w:r>
+    </w:p>
+    <w:p>
+      <w:r>
+        <w:t>The final set must contain exactly seven unique objects, five full-run objects, and the approved two-object rotation pair. Each approved phase must have exactly six selected objects physically on view.</w:t>
+      </w:r>
+    </w:p>
+    <w:p>
+      <w:pPr>
+        <w:pStyle w:val="Heading1"/>
+      </w:pPr>
+      <w:r>
+        <w:t>5. Determine public priority and public fields</w:t>
+      </w:r>
+    </w:p>
+    <w:p>
+      <w:r>
+        <w:t>Number the final seven using the controlling Coverage Directive theme_order. Within each theme, use the controlling Public Copy Freeze within_theme_sequence. Do not number by eligible rank, provisional order, replacement order, or gallery route.</w:t>
+      </w:r>
+    </w:p>
+    <w:p>
+      <w:r>
+        <w:t>Use public_title, public_credit_line, public_accessibility_label, and public_hook from the controlling approved Public Copy Freeze row. Do not substitute Object Register wording when frozen wording differs.</w:t>
+      </w:r>
+    </w:p>
+    <w:p>
+      <w:r>
+        <w:t>Use era/year and primary material from Object Register; story theme from Object Register; gallery and zone from the controlling approved placement override when one exists, otherwise from the controlling ready Placement Request; on-view range from the controlling approved Rotation Approval.</w:t>
+      </w:r>
+    </w:p>
+    <w:p>
+      <w:pPr>
+        <w:pStyle w:val="Heading1"/>
+      </w:pPr>
+      <w:r>
+        <w:t>6. Required public panel</w:t>
+      </w:r>
+    </w:p>
+    <w:p>
+      <w:r>
+        <w:t>Create one 1200 × 1600 portrait museum feature panel with the exact title “Working Waterfront: Featured Objects”, subtitle “Spring 2027 Community History Exhibition”, and exhibition dates “March 20–August 15, 2027”.</w:t>
+      </w:r>
+    </w:p>
+    <w:p>
+      <w:r>
+        <w:t>For each final object, publish:</w:t>
       </w:r>
     </w:p>
     <w:p>
@@ -92,193 +217,7 @@
         <w:pStyle w:val="ListBullet"/>
       </w:pPr>
       <w:r>
-        <w:t>Object Register status is active.</w:t>
-      </w:r>
-    </w:p>
-    <w:p>
-      <w:pPr>
-        <w:pStyle w:val="ListBullet"/>
-      </w:pPr>
-      <w:r>
-        <w:t>The controlling Curatorial Review is final and approved; public label copy is final; the image asset is approved; and the research packet is complete.</w:t>
-      </w:r>
-    </w:p>
-    <w:p>
-      <w:pPr>
-        <w:pStyle w:val="ListBullet"/>
-      </w:pPr>
-      <w:r>
-        <w:t>Curatorial component minimums are: community relevance 82, narrative strength 82, provenance confidence 80, visual impact 78, and accessibility value 78.</w:t>
-      </w:r>
-    </w:p>
-    <w:p>
-      <w:pPr>
-        <w:pStyle w:val="ListBullet"/>
-      </w:pPr>
-      <w:r>
-        <w:t>The controlling Interpretation Review approves the public feature, public label, alt text, and credit line. An Audio stop also requires approved audio and transcript. A Large-print transcript requires an approved transcript. A Tactile replica requires an approved tactile asset.</w:t>
-      </w:r>
-    </w:p>
-    <w:p>
-      <w:pPr>
-        <w:pStyle w:val="ListBullet"/>
-      </w:pPr>
-      <w:r>
-        <w:t>The controlling Loan and Insurance record is confirmed and signed, has no public-display restriction, and covers the object’s complete assigned on-view window.</w:t>
-      </w:r>
-    </w:p>
-    <w:p>
-      <w:pPr>
-        <w:pStyle w:val="ListBullet"/>
-      </w:pPr>
-      <w:r>
-        <w:t>The controlling Rights and Credits record is cleared for gallery_and_promotion, has an approved credit line, starts by 25 February 2027, and remains valid through 15 August 2027.</w:t>
-      </w:r>
-    </w:p>
-    <w:p>
-      <w:pPr>
-        <w:pStyle w:val="ListBullet"/>
-      </w:pPr>
-      <w:r>
-        <w:t>The controlling Conservation Assessment is completed, display-approved, treatment is complete or not required, the mount is ready, and max_display_days covers the assigned on-view window.</w:t>
-      </w:r>
-    </w:p>
-    <w:p>
-      <w:pPr>
-        <w:pStyle w:val="ListBullet"/>
-      </w:pPr>
-      <w:r>
-        <w:t>The controlling Rotation Approval is approved and its dates exactly match the public on-view window.</w:t>
-      </w:r>
-    </w:p>
-    <w:p>
-      <w:pPr>
-        <w:pStyle w:val="ListBullet"/>
-      </w:pPr>
-      <w:r>
-        <w:t>The controlling Placement Request is ready. The assigned open zone must support the required case type and fit the object dimensions, weight, planned lux, and humidity range.</w:t>
-      </w:r>
-    </w:p>
-    <w:p>
-      <w:pPr>
-        <w:pStyle w:val="Heading1"/>
-      </w:pPr>
-      <w:r>
-        <w:t>3. Curatorial score and eligible ranking</w:t>
-      </w:r>
-    </w:p>
-    <w:p>
-      <w:r>
-        <w:t>Calculate Curatorial score = 30% community relevance + 25% narrative strength + 20% provenance confidence + 15% visual impact + 10% accessibility value.</w:t>
-      </w:r>
-    </w:p>
-    <w:p>
-      <w:r>
-        <w:t>Rank individually eligible objects by: (1) Curatorial score, descending; (2) community relevance, descending; (3) installation crew-minutes, ascending, where crew-minutes = install_minutes × required_crew; and (4) accession number, ascending.</w:t>
-      </w:r>
-    </w:p>
-    <w:p>
-      <w:pPr>
-        <w:pStyle w:val="Heading1"/>
-      </w:pPr>
-      <w:r>
-        <w:t>4. Build the provisional seven-object set</w:t>
-      </w:r>
-    </w:p>
-    <w:p>
-      <w:r>
-        <w:t>The provisional set must contain exactly seven objects and cover all five required story themes: Waterfront Work; Transit and Movement; Flood and Resilience; Community Voice; Markets and Exchange.</w:t>
-      </w:r>
-    </w:p>
-    <w:p>
-      <w:r>
-        <w:t>First take the highest-ranked eligible object for each required theme. Then scan the eligible ranking from the top and add objects until there are seven, while maintaining these limits:</w:t>
-      </w:r>
-    </w:p>
-    <w:p>
-      <w:pPr>
-        <w:pStyle w:val="ListBullet"/>
-      </w:pPr>
-      <w:r>
-        <w:t>no more than two objects from one collection;</w:t>
-      </w:r>
-    </w:p>
-    <w:p>
-      <w:pPr>
-        <w:pStyle w:val="ListBullet"/>
-      </w:pPr>
-      <w:r>
-        <w:t>no more than two objects assigned to one gallery;</w:t>
-      </w:r>
-    </w:p>
-    <w:p>
-      <w:pPr>
-        <w:pStyle w:val="ListBullet"/>
-      </w:pPr>
-      <w:r>
-        <w:t>at least five distinct object types;</w:t>
-      </w:r>
-    </w:p>
-    <w:p>
-      <w:pPr>
-        <w:pStyle w:val="ListBullet"/>
-      </w:pPr>
-      <w:r>
-        <w:t>at least three Audio stops, at least two Tactile replicas, and at least one Large-print transcript.</w:t>
-      </w:r>
-    </w:p>
-    <w:p>
-      <w:pPr>
-        <w:pStyle w:val="Heading1"/>
-      </w:pPr>
-      <w:r>
-        <w:t>5. Ordered resource review and replacement</w:t>
-      </w:r>
-    </w:p>
-    <w:p>
-      <w:r>
-        <w:t>Review the provisional set in this exact order: (1) zone slot counts; (2) Case Inventory quantities; (3) confirmed gallery installation crew-minute capacity.</w:t>
-      </w:r>
-    </w:p>
-    <w:p>
-      <w:r>
-        <w:t>When a conflict is found, preserve required-theme anchor objects whenever possible. Remove the lowest-ranked non-anchor object that contributes to the first unresolved conflict.</w:t>
-      </w:r>
-    </w:p>
-    <w:p>
-      <w:r>
-        <w:t>Then scan the eligible ranking from the top for the next not-yet-selected object. Do not reconsider an object already removed. A replacement must preserve every theme, collection, gallery, object-type, and accessibility-feature constraint and must not recreate any resource conflict already resolved. Repeat until seven feasible objects remain.</w:t>
-      </w:r>
-    </w:p>
-    <w:p>
-      <w:r>
-        <w:t>After replacement, present the final objects in eligible-rank order, not in the order in which replacements were made.</w:t>
-      </w:r>
-    </w:p>
-    <w:p>
-      <w:pPr>
-        <w:pStyle w:val="Heading1"/>
-      </w:pPr>
-      <w:r>
-        <w:t>6. Public panel content</w:t>
-      </w:r>
-    </w:p>
-    <w:p>
-      <w:r>
-        <w:t>Create a single 1200 × 1600 portrait museum feature panel. It must use the exact title “Working Waterfront: Featured Objects” and subtitle “Spring 2027 Community History Exhibition”, plus the exhibition dates “March 20–August 15, 2027”.</w:t>
-      </w:r>
-    </w:p>
-    <w:p>
-      <w:r>
-        <w:t>For each of the seven final objects, show all of the following public facts:</w:t>
-      </w:r>
-    </w:p>
-    <w:p>
-      <w:pPr>
-        <w:pStyle w:val="ListBullet"/>
-      </w:pPr>
-      <w:r>
-        <w:t>final priority number and display title;</w:t>
+        <w:t>public priority number and frozen public title;</w:t>
       </w:r>
     </w:p>
     <w:p>
@@ -294,7 +233,7 @@
         <w:pStyle w:val="ListBullet"/>
       </w:pPr>
       <w:r>
-        <w:t>era/year and primary material;</w:t>
+        <w:t>era/year and every named primary material;</w:t>
       </w:r>
     </w:p>
     <w:p>
@@ -302,7 +241,7 @@
         <w:pStyle w:val="ListBullet"/>
       </w:pPr>
       <w:r>
-        <w:t>gallery and zone ID;</w:t>
+        <w:t>controlling public gallery and zone ID;</w:t>
       </w:r>
     </w:p>
     <w:p>
@@ -318,7 +257,7 @@
         <w:pStyle w:val="ListBullet"/>
       </w:pPr>
       <w:r>
-        <w:t>exact public credit line;</w:t>
+        <w:t>frozen public credit line;</w:t>
       </w:r>
     </w:p>
     <w:p>
@@ -326,7 +265,7 @@
         <w:pStyle w:val="ListBullet"/>
       </w:pPr>
       <w:r>
-        <w:t>exact on-view date range;</w:t>
+        <w:t>exact approved on-view range;</w:t>
       </w:r>
     </w:p>
     <w:p>
@@ -334,7 +273,7 @@
         <w:pStyle w:val="ListBullet"/>
       </w:pPr>
       <w:r>
-        <w:t>approved accessibility feature;</w:t>
+        <w:t>frozen public accessibility label;</w:t>
       </w:r>
     </w:p>
     <w:p>
@@ -342,27 +281,7 @@
         <w:pStyle w:val="ListBullet"/>
       </w:pPr>
       <w:r>
-        <w:t>the concise interpretive hook from Object Register.</w:t>
-      </w:r>
-    </w:p>
-    <w:p>
-      <w:r>
-        <w:t>Add a “Plan Your Visit” route in gallery route order. For each gallery, list every selected object assigned there and the selected-object count for that gallery.</w:t>
-      </w:r>
-    </w:p>
-    <w:p>
-      <w:r>
-        <w:t>Add a “Rotation Notice” giving the two limited-run documents, each exact on-view range, and inclusive day count.</w:t>
-      </w:r>
-    </w:p>
-    <w:p>
-      <w:r>
-        <w:t>Add a “Selection Snapshot” containing: featured-object count; gallery count; theme count; earliest and latest object years; numeric year span; gallery distribution; theme distribution; collection distribution; object-type count; Audio-stop count; Tactile-replica count; Large-print-transcript count; full-run object count; and limited-run rotation-object count.</w:t>
-      </w:r>
-    </w:p>
-    <w:p>
-      <w:r>
-        <w:t>Do not show internal component scores, rejection reasons, case shortages, or crew calculations. Do not present any unselected object as featured, routed, rotated, or recommended.</w:t>
+        <w:t>frozen concise public hook.</w:t>
       </w:r>
     </w:p>
     <w:p>
@@ -370,49 +289,102 @@
         <w:pStyle w:val="Heading1"/>
       </w:pPr>
       <w:r>
-        <w:t>Appendix: public-field semantics</w:t>
+        <w:t>7. Required public summaries</w:t>
+      </w:r>
+    </w:p>
+    <w:p>
+      <w:r>
+        <w:t>Plan Your Visit — Opening rotation: list the five official galleries in route order, the selected objects visible from March 20 through May 31, and each gallery’s visible-object count.</w:t>
+      </w:r>
+    </w:p>
+    <w:p>
+      <w:r>
+        <w:t>Plan Your Visit — Closing rotation: repeat for June 1 through August 15.</w:t>
+      </w:r>
+    </w:p>
+    <w:p>
+      <w:r>
+        <w:t>Rotation Notice: name the two limited-run objects, show both exact date ranges, and calculate inclusive days by counting both endpoints.</w:t>
+      </w:r>
+    </w:p>
+    <w:p>
+      <w:r>
+        <w:t>Selection Snapshot: show seven unique featured objects; six objects visible in each phase; gallery count; exact theme distribution; collection distribution; distinct object-type count; earliest and latest years and numeric span; frozen accessibility-label counts; and full-run versus limited-run counts.</w:t>
+      </w:r>
+    </w:p>
+    <w:p>
+      <w:pPr>
+        <w:pStyle w:val="Heading1"/>
+      </w:pPr>
+      <w:r>
+        <w:t>8. Publication exclusions</w:t>
+      </w:r>
+    </w:p>
+    <w:p>
+      <w:r>
+        <w:t>Do not publish component scores, eligibility failures, operational intermediate selections, commitment tiers, resource conflicts, crew calculations, route-capacity changes, placement-override reasons, replacement reasons, or record cutoffs. No unselected object may receive featured, route, rotation, recommendation, or equivalent public status.</w:t>
+      </w:r>
+    </w:p>
+    <w:p>
+      <w:pPr>
+        <w:pStyle w:val="Heading1"/>
+      </w:pPr>
+      <w:r>
+        <w:t>Appendix: field authority</w:t>
       </w:r>
     </w:p>
     <w:tbl>
       <w:tblPr>
         <w:tblStyle w:val="TableGrid"/>
         <w:tblW w:type="auto" w:w="0"/>
+        <w:jc w:val="center"/>
         <w:tblLook w:firstColumn="1" w:firstRow="1" w:lastColumn="0" w:lastRow="0" w:noHBand="0" w:noVBand="1" w:val="04A0"/>
       </w:tblPr>
       <w:tblGrid>
-        <w:gridCol w:w="4968"/>
-        <w:gridCol w:w="4968"/>
+        <w:gridCol w:w="3408"/>
+        <w:gridCol w:w="3408"/>
+        <w:gridCol w:w="3408"/>
       </w:tblGrid>
       <w:tr>
         <w:tc>
           <w:tcPr>
-            <w:tcW w:type="dxa" w:w="4968"/>
+            <w:tcW w:type="dxa" w:w="3408"/>
+            <w:vAlign w:val="top"/>
           </w:tcPr>
           <w:p>
             <w:pPr>
-              <w:spacing w:after="40"/>
+              <w:spacing w:after="20"/>
             </w:pPr>
             <w:r>
-              <w:rPr>
-                <w:sz w:val="19"/>
-              </w:rPr>
-              <w:t>Field</w:t>
+              <w:t>Public field</w:t>
             </w:r>
           </w:p>
         </w:tc>
         <w:tc>
           <w:tcPr>
-            <w:tcW w:type="dxa" w:w="4968"/>
+            <w:tcW w:type="dxa" w:w="3408"/>
+            <w:vAlign w:val="top"/>
           </w:tcPr>
           <w:p>
             <w:pPr>
-              <w:spacing w:after="40"/>
+              <w:spacing w:after="20"/>
             </w:pPr>
             <w:r>
-              <w:rPr>
-                <w:sz w:val="19"/>
-              </w:rPr>
-              <w:t>Use on the panel</w:t>
+              <w:t>Controlling source</w:t>
+            </w:r>
+          </w:p>
+        </w:tc>
+        <w:tc>
+          <w:tcPr>
+            <w:tcW w:type="dxa" w:w="3408"/>
+            <w:vAlign w:val="top"/>
+          </w:tcPr>
+          <w:p>
+            <w:pPr>
+              <w:spacing w:after="20"/>
+            </w:pPr>
+            <w:r>
+              <w:t>Important rule</w:t>
             </w:r>
           </w:p>
         </w:tc>
@@ -420,33 +392,43 @@
       <w:tr>
         <w:tc>
           <w:tcPr>
-            <w:tcW w:type="dxa" w:w="4968"/>
+            <w:tcW w:type="dxa" w:w="3408"/>
+            <w:vAlign w:val="top"/>
           </w:tcPr>
           <w:p>
             <w:pPr>
-              <w:spacing w:after="40"/>
+              <w:spacing w:after="20"/>
             </w:pPr>
             <w:r>
-              <w:rPr>
-                <w:sz w:val="19"/>
-              </w:rPr>
-              <w:t>Era/year</w:t>
+              <w:t>Final set</w:t>
             </w:r>
           </w:p>
         </w:tc>
         <w:tc>
           <w:tcPr>
-            <w:tcW w:type="dxa" w:w="4968"/>
+            <w:tcW w:type="dxa" w:w="3408"/>
+            <w:vAlign w:val="top"/>
           </w:tcPr>
           <w:p>
             <w:pPr>
-              <w:spacing w:after="40"/>
+              <w:spacing w:after="20"/>
             </w:pPr>
             <w:r>
-              <w:rPr>
-                <w:sz w:val="19"/>
-              </w:rPr>
-              <w:t>Use Object Register era_label; do not infer from accession number.</w:t>
+              <w:t>All original workbooks + approved program overlay</w:t>
+            </w:r>
+          </w:p>
+        </w:tc>
+        <w:tc>
+          <w:tcPr>
+            <w:tcW w:type="dxa" w:w="3408"/>
+            <w:vAlign w:val="top"/>
+          </w:tcPr>
+          <w:p>
+            <w:pPr>
+              <w:spacing w:after="20"/>
+            </w:pPr>
+            <w:r>
+              <w:t>Do not stop at the operational seven.</w:t>
             </w:r>
           </w:p>
         </w:tc>
@@ -454,33 +436,43 @@
       <w:tr>
         <w:tc>
           <w:tcPr>
-            <w:tcW w:type="dxa" w:w="4968"/>
+            <w:tcW w:type="dxa" w:w="3408"/>
+            <w:vAlign w:val="top"/>
           </w:tcPr>
           <w:p>
             <w:pPr>
-              <w:spacing w:after="40"/>
+              <w:spacing w:after="20"/>
             </w:pPr>
             <w:r>
-              <w:rPr>
-                <w:sz w:val="19"/>
-              </w:rPr>
-              <w:t>Primary material</w:t>
+              <w:t>Priority/order</w:t>
             </w:r>
           </w:p>
         </w:tc>
         <w:tc>
           <w:tcPr>
-            <w:tcW w:type="dxa" w:w="4968"/>
+            <w:tcW w:type="dxa" w:w="3408"/>
+            <w:vAlign w:val="top"/>
           </w:tcPr>
           <w:p>
             <w:pPr>
-              <w:spacing w:after="40"/>
+              <w:spacing w:after="20"/>
             </w:pPr>
             <w:r>
-              <w:rPr>
-                <w:sz w:val="19"/>
-              </w:rPr>
-              <w:t>Use material_summary exactly enough to preserve all named materials.</w:t>
+              <w:t>Coverage Directives + Public Copy Freeze</w:t>
+            </w:r>
+          </w:p>
+        </w:tc>
+        <w:tc>
+          <w:tcPr>
+            <w:tcW w:type="dxa" w:w="3408"/>
+            <w:vAlign w:val="top"/>
+          </w:tcPr>
+          <w:p>
+            <w:pPr>
+              <w:spacing w:after="20"/>
+            </w:pPr>
+            <w:r>
+              <w:t>Theme order, then within-theme sequence.</w:t>
             </w:r>
           </w:p>
         </w:tc>
@@ -488,33 +480,43 @@
       <w:tr>
         <w:tc>
           <w:tcPr>
-            <w:tcW w:type="dxa" w:w="4968"/>
+            <w:tcW w:type="dxa" w:w="3408"/>
+            <w:vAlign w:val="top"/>
           </w:tcPr>
           <w:p>
             <w:pPr>
-              <w:spacing w:after="40"/>
+              <w:spacing w:after="20"/>
             </w:pPr>
             <w:r>
-              <w:rPr>
-                <w:sz w:val="19"/>
-              </w:rPr>
-              <w:t>Gallery and zone</w:t>
+              <w:t>Public title</w:t>
             </w:r>
           </w:p>
         </w:tc>
         <w:tc>
           <w:tcPr>
-            <w:tcW w:type="dxa" w:w="4968"/>
+            <w:tcW w:type="dxa" w:w="3408"/>
+            <w:vAlign w:val="top"/>
           </w:tcPr>
           <w:p>
             <w:pPr>
-              <w:spacing w:after="40"/>
+              <w:spacing w:after="20"/>
             </w:pPr>
             <w:r>
-              <w:rPr>
-                <w:sz w:val="19"/>
-              </w:rPr>
-              <w:t>Use the controlling ready Placement Request.</w:t>
+              <w:t>Public Copy Freeze</w:t>
+            </w:r>
+          </w:p>
+        </w:tc>
+        <w:tc>
+          <w:tcPr>
+            <w:tcW w:type="dxa" w:w="3408"/>
+            <w:vAlign w:val="top"/>
+          </w:tcPr>
+          <w:p>
+            <w:pPr>
+              <w:spacing w:after="20"/>
+            </w:pPr>
+            <w:r>
+              <w:t>Use frozen wording exactly.</w:t>
             </w:r>
           </w:p>
         </w:tc>
@@ -522,33 +524,43 @@
       <w:tr>
         <w:tc>
           <w:tcPr>
-            <w:tcW w:type="dxa" w:w="4968"/>
+            <w:tcW w:type="dxa" w:w="3408"/>
+            <w:vAlign w:val="top"/>
           </w:tcPr>
           <w:p>
             <w:pPr>
-              <w:spacing w:after="40"/>
+              <w:spacing w:after="20"/>
             </w:pPr>
             <w:r>
-              <w:rPr>
-                <w:sz w:val="19"/>
-              </w:rPr>
-              <w:t>On-view range</w:t>
+              <w:t>Credit</w:t>
             </w:r>
           </w:p>
         </w:tc>
         <w:tc>
           <w:tcPr>
-            <w:tcW w:type="dxa" w:w="4968"/>
+            <w:tcW w:type="dxa" w:w="3408"/>
+            <w:vAlign w:val="top"/>
           </w:tcPr>
           <w:p>
             <w:pPr>
-              <w:spacing w:after="40"/>
+              <w:spacing w:after="20"/>
             </w:pPr>
             <w:r>
-              <w:rPr>
-                <w:sz w:val="19"/>
-              </w:rPr>
-              <w:t>Use the controlling approved Rotation Approval, not the full exhibition dates by default.</w:t>
+              <w:t>Public Copy Freeze</w:t>
+            </w:r>
+          </w:p>
+        </w:tc>
+        <w:tc>
+          <w:tcPr>
+            <w:tcW w:type="dxa" w:w="3408"/>
+            <w:vAlign w:val="top"/>
+          </w:tcPr>
+          <w:p>
+            <w:pPr>
+              <w:spacing w:after="20"/>
+            </w:pPr>
+            <w:r>
+              <w:t>Use frozen approved line, not an older register line.</w:t>
             </w:r>
           </w:p>
         </w:tc>
@@ -556,33 +568,43 @@
       <w:tr>
         <w:tc>
           <w:tcPr>
-            <w:tcW w:type="dxa" w:w="4968"/>
+            <w:tcW w:type="dxa" w:w="3408"/>
+            <w:vAlign w:val="top"/>
           </w:tcPr>
           <w:p>
             <w:pPr>
-              <w:spacing w:after="40"/>
+              <w:spacing w:after="20"/>
             </w:pPr>
             <w:r>
-              <w:rPr>
-                <w:sz w:val="19"/>
-              </w:rPr>
-              <w:t>Credit line</w:t>
+              <w:t>Accessibility label</w:t>
             </w:r>
           </w:p>
         </w:tc>
         <w:tc>
           <w:tcPr>
-            <w:tcW w:type="dxa" w:w="4968"/>
+            <w:tcW w:type="dxa" w:w="3408"/>
+            <w:vAlign w:val="top"/>
           </w:tcPr>
           <w:p>
             <w:pPr>
-              <w:spacing w:after="40"/>
+              <w:spacing w:after="20"/>
             </w:pPr>
             <w:r>
-              <w:rPr>
-                <w:sz w:val="19"/>
-              </w:rPr>
-              <w:t>Use public_credit_line from Object Register only after the controlling Interpretation and Rights records approve it.</w:t>
+              <w:t>Public Copy Freeze</w:t>
+            </w:r>
+          </w:p>
+        </w:tc>
+        <w:tc>
+          <w:tcPr>
+            <w:tcW w:type="dxa" w:w="3408"/>
+            <w:vAlign w:val="top"/>
+          </w:tcPr>
+          <w:p>
+            <w:pPr>
+              <w:spacing w:after="20"/>
+            </w:pPr>
+            <w:r>
+              <w:t>Use public label such as Audio story, Touch replica, or Large-print copy.</w:t>
             </w:r>
           </w:p>
         </w:tc>
@@ -590,33 +612,175 @@
       <w:tr>
         <w:tc>
           <w:tcPr>
-            <w:tcW w:type="dxa" w:w="4968"/>
+            <w:tcW w:type="dxa" w:w="3408"/>
+            <w:vAlign w:val="top"/>
           </w:tcPr>
           <w:p>
             <w:pPr>
-              <w:spacing w:after="40"/>
+              <w:spacing w:after="20"/>
             </w:pPr>
             <w:r>
-              <w:rPr>
-                <w:sz w:val="19"/>
-              </w:rPr>
-              <w:t>Interpretive hook</w:t>
+              <w:t>Gallery/zone</w:t>
             </w:r>
           </w:p>
         </w:tc>
         <w:tc>
           <w:tcPr>
-            <w:tcW w:type="dxa" w:w="4968"/>
+            <w:tcW w:type="dxa" w:w="3408"/>
+            <w:vAlign w:val="top"/>
           </w:tcPr>
           <w:p>
             <w:pPr>
-              <w:spacing w:after="40"/>
+              <w:spacing w:after="20"/>
             </w:pPr>
             <w:r>
-              <w:rPr>
-                <w:sz w:val="19"/>
-              </w:rPr>
-              <w:t>Use interpretation_tag from Object Register; concise paraphrase is acceptable only when every factual idea is retained.</w:t>
+              <w:t>Placement Override or Placement Request</w:t>
+            </w:r>
+          </w:p>
+        </w:tc>
+        <w:tc>
+          <w:tcPr>
+            <w:tcW w:type="dxa" w:w="3408"/>
+            <w:vAlign w:val="top"/>
+          </w:tcPr>
+          <w:p>
+            <w:pPr>
+              <w:spacing w:after="20"/>
+            </w:pPr>
+            <w:r>
+              <w:t>Approved active override has precedence.</w:t>
+            </w:r>
+          </w:p>
+        </w:tc>
+      </w:tr>
+      <w:tr>
+        <w:tc>
+          <w:tcPr>
+            <w:tcW w:type="dxa" w:w="3408"/>
+            <w:vAlign w:val="top"/>
+          </w:tcPr>
+          <w:p>
+            <w:pPr>
+              <w:spacing w:after="20"/>
+            </w:pPr>
+            <w:r>
+              <w:t>On-view range</w:t>
+            </w:r>
+          </w:p>
+        </w:tc>
+        <w:tc>
+          <w:tcPr>
+            <w:tcW w:type="dxa" w:w="3408"/>
+            <w:vAlign w:val="top"/>
+          </w:tcPr>
+          <w:p>
+            <w:pPr>
+              <w:spacing w:after="20"/>
+            </w:pPr>
+            <w:r>
+              <w:t>Rotation Approvals</w:t>
+            </w:r>
+          </w:p>
+        </w:tc>
+        <w:tc>
+          <w:tcPr>
+            <w:tcW w:type="dxa" w:w="3408"/>
+            <w:vAlign w:val="top"/>
+          </w:tcPr>
+          <w:p>
+            <w:pPr>
+              <w:spacing w:after="20"/>
+            </w:pPr>
+            <w:r>
+              <w:t>Never assume full exhibition dates.</w:t>
+            </w:r>
+          </w:p>
+        </w:tc>
+      </w:tr>
+      <w:tr>
+        <w:tc>
+          <w:tcPr>
+            <w:tcW w:type="dxa" w:w="3408"/>
+            <w:vAlign w:val="top"/>
+          </w:tcPr>
+          <w:p>
+            <w:pPr>
+              <w:spacing w:after="20"/>
+            </w:pPr>
+            <w:r>
+              <w:t>Phase route</w:t>
+            </w:r>
+          </w:p>
+        </w:tc>
+        <w:tc>
+          <w:tcPr>
+            <w:tcW w:type="dxa" w:w="3408"/>
+            <w:vAlign w:val="top"/>
+          </w:tcPr>
+          <w:p>
+            <w:pPr>
+              <w:spacing w:after="20"/>
+            </w:pPr>
+            <w:r>
+              <w:t>Phase Definitions + Visitor Route Plan</w:t>
+            </w:r>
+          </w:p>
+        </w:tc>
+        <w:tc>
+          <w:tcPr>
+            <w:tcW w:type="dxa" w:w="3408"/>
+            <w:vAlign w:val="top"/>
+          </w:tcPr>
+          <w:p>
+            <w:pPr>
+              <w:spacing w:after="20"/>
+            </w:pPr>
+            <w:r>
+              <w:t>List only objects visible during that phase.</w:t>
+            </w:r>
+          </w:p>
+        </w:tc>
+      </w:tr>
+      <w:tr>
+        <w:tc>
+          <w:tcPr>
+            <w:tcW w:type="dxa" w:w="3408"/>
+            <w:vAlign w:val="top"/>
+          </w:tcPr>
+          <w:p>
+            <w:pPr>
+              <w:spacing w:after="20"/>
+            </w:pPr>
+            <w:r>
+              <w:t>Inclusive days</w:t>
+            </w:r>
+          </w:p>
+        </w:tc>
+        <w:tc>
+          <w:tcPr>
+            <w:tcW w:type="dxa" w:w="3408"/>
+            <w:vAlign w:val="top"/>
+          </w:tcPr>
+          <w:p>
+            <w:pPr>
+              <w:spacing w:after="20"/>
+            </w:pPr>
+            <w:r>
+              <w:t>Derived from approved dates</w:t>
+            </w:r>
+          </w:p>
+        </w:tc>
+        <w:tc>
+          <w:tcPr>
+            <w:tcW w:type="dxa" w:w="3408"/>
+            <w:vAlign w:val="top"/>
+          </w:tcPr>
+          <w:p>
+            <w:pPr>
+              <w:spacing w:after="20"/>
+            </w:pPr>
+            <w:r>
+              <w:t>Count both start and end dates.</w:t>
             </w:r>
           </w:p>
         </w:tc>
@@ -624,7 +788,7 @@
     </w:tbl>
     <w:sectPr>
       <w:pgSz w:w="12240" w:h="15840"/>
-      <w:pgMar w:top="1008" w:right="1152" w:bottom="1008" w:left="1152" w:header="720" w:footer="720" w:gutter="0"/>
+      <w:pgMar w:top="936" w:right="1008" w:bottom="936" w:left="1008" w:header="720" w:footer="720" w:gutter="0"/>
       <w:cols w:space="720"/>
       <w:docGrid w:linePitch="360"/>
     </w:sectPr>
@@ -996,8 +1160,8 @@
     <w:qFormat/>
     <w:rsid w:val="00FC693F"/>
     <w:rPr>
-      <w:rFonts w:ascii="Arial" w:hAnsi="Arial" w:eastAsia="Arial"/>
-      <w:sz w:val="21"/>
+      <w:rFonts w:ascii="Arial" w:hAnsi="Arial"/>
+      <w:sz w:val="19"/>
     </w:rPr>
   </w:style>
   <w:style w:type="paragraph" w:styleId="Header">
@@ -1059,10 +1223,9 @@
       <w:outlineLvl w:val="0"/>
     </w:pPr>
     <w:rPr>
-      <w:rFonts w:asciiTheme="majorHAnsi" w:eastAsiaTheme="majorEastAsia" w:hAnsiTheme="majorHAnsi" w:cstheme="majorBidi" w:ascii="Arial" w:hAnsi="Arial" w:eastAsia="Arial"/>
+      <w:rFonts w:asciiTheme="majorHAnsi" w:eastAsiaTheme="majorEastAsia" w:hAnsiTheme="majorHAnsi" w:cstheme="majorBidi" w:ascii="Arial" w:hAnsi="Arial"/>
       <w:b/>
       <w:bCs/>
-      <w:color w:val="17365D"/>
       <w:sz w:val="28"/>
       <w:szCs w:val="28"/>
     </w:rPr>
@@ -1083,10 +1246,9 @@
       <w:outlineLvl w:val="1"/>
     </w:pPr>
     <w:rPr>
-      <w:rFonts w:asciiTheme="majorHAnsi" w:eastAsiaTheme="majorEastAsia" w:hAnsiTheme="majorHAnsi" w:cstheme="majorBidi" w:ascii="Arial" w:hAnsi="Arial" w:eastAsia="Arial"/>
+      <w:rFonts w:asciiTheme="majorHAnsi" w:eastAsiaTheme="majorEastAsia" w:hAnsiTheme="majorHAnsi" w:cstheme="majorBidi" w:ascii="Arial" w:hAnsi="Arial"/>
       <w:b/>
       <w:bCs/>
-      <w:color w:val="1F4E79"/>
       <w:sz w:val="26"/>
       <w:szCs w:val="26"/>
     </w:rPr>
@@ -1107,7 +1269,7 @@
       <w:outlineLvl w:val="2"/>
     </w:pPr>
     <w:rPr>
-      <w:rFonts w:asciiTheme="majorHAnsi" w:eastAsiaTheme="majorEastAsia" w:hAnsiTheme="majorHAnsi" w:cstheme="majorBidi" w:ascii="Arial" w:hAnsi="Arial" w:eastAsia="Arial"/>
+      <w:rFonts w:asciiTheme="majorHAnsi" w:eastAsiaTheme="majorEastAsia" w:hAnsiTheme="majorHAnsi" w:cstheme="majorBidi"/>
       <w:b/>
       <w:bCs/>
       <w:color w:val="4F81BD" w:themeColor="accent1"/>
@@ -1348,11 +1510,12 @@
       <w:contextualSpacing/>
     </w:pPr>
     <w:rPr>
-      <w:rFonts w:asciiTheme="majorHAnsi" w:eastAsiaTheme="majorEastAsia" w:hAnsiTheme="majorHAnsi" w:cstheme="majorBidi" w:ascii="Arial" w:hAnsi="Arial" w:eastAsia="Arial"/>
+      <w:rFonts w:asciiTheme="majorHAnsi" w:eastAsiaTheme="majorEastAsia" w:hAnsiTheme="majorHAnsi" w:cstheme="majorBidi" w:ascii="Arial" w:hAnsi="Arial"/>
+      <w:b/>
       <w:color w:val="17365D" w:themeColor="text2" w:themeShade="BF"/>
       <w:spacing w:val="5"/>
       <w:kern w:val="28"/>
-      <w:sz w:val="52"/>
+      <w:sz w:val="48"/>
       <w:szCs w:val="52"/>
     </w:rPr>
   </w:style>
@@ -1385,7 +1548,7 @@
       </w:numPr>
     </w:pPr>
     <w:rPr>
-      <w:rFonts w:asciiTheme="majorHAnsi" w:eastAsiaTheme="majorEastAsia" w:hAnsiTheme="majorHAnsi" w:cstheme="majorBidi" w:ascii="Arial" w:hAnsi="Arial" w:eastAsia="Arial"/>
+      <w:rFonts w:asciiTheme="majorHAnsi" w:eastAsiaTheme="majorEastAsia" w:hAnsiTheme="majorHAnsi" w:cstheme="majorBidi"/>
       <w:i/>
       <w:iCs/>
       <w:color w:val="4F81BD" w:themeColor="accent1"/>

</xml_diff>

<commit_message>
update benchmark cases and evaluation assets
</commit_message>
<xml_diff>
--- a/cases/data_selection/data_selection_006/env/curatorial_brief.docx
+++ b/cases/data_selection/data_selection_006/env/curatorial_brief.docx
@@ -5,790 +5,378 @@
     <w:p>
       <w:pPr>
         <w:pStyle w:val="Title"/>
+        <w:widowControl/>
         <w:jc w:val="center"/>
       </w:pPr>
       <w:r>
         <w:t>Working Waterfront</w:t>
-        <w:br/>
+      </w:r>
+    </w:p>
+    <w:p>
+      <w:pPr>
+        <w:widowControl/>
+        <w:jc w:val="center"/>
+      </w:pPr>
+      <w:r>
+        <w:rPr>
+          <w:b/>
+          <w:sz w:val="22"/>
+        </w:rPr>
         <w:t>Feature Object Selection and Publication Brief</w:t>
       </w:r>
     </w:p>
     <w:p>
       <w:pPr>
+        <w:widowControl/>
         <w:jc w:val="center"/>
       </w:pPr>
       <w:r>
         <w:rPr>
           <w:b/>
+          <w:sz w:val="22"/>
         </w:rPr>
         <w:t>Spring 2027 Community History Exhibition</w:t>
       </w:r>
+    </w:p>
+    <w:p>
+      <w:pPr>
+        <w:widowControl/>
+      </w:pPr>
       <w:r>
-        <w:br/>
         <w:t>Base-record cutoff: 18 February 2027, 4:00 PM</w:t>
-      </w:r>
-      <w:r>
         <w:br/>
         <w:t>Program-overlay cutoff: 20 February 2027, 5:00 PM</w:t>
-      </w:r>
-      <w:r>
         <w:br/>
-        <w:t>Public-copy freeze: 25 February 2027, 12:00 PM</w:t>
+        <w:t>Public-copy freeze: 25 February 2027, 12:00 PM (exclusive)</w:t>
       </w:r>
     </w:p>
     <w:p>
       <w:pPr>
         <w:pStyle w:val="Heading1"/>
+        <w:widowControl/>
       </w:pPr>
       <w:r>
         <w:t>Purpose</w:t>
       </w:r>
     </w:p>
     <w:p>
+      <w:pPr>
+        <w:widowControl/>
+      </w:pPr>
       <w:r>
-        <w:t>Prepare one public-facing museum feature panel from the final seven-object selection. The four original workbooks establish individual eligibility, eligible ranking, the provisional set, and the ordered operational feasibility reviews. public_program_freeze.xlsx then applies the approved community-program overlay, active placement and route-capacity overrides, phase definitions, and the frozen public copy. The operational seven-object set is not the publishable final set.</w:t>
+        <w:t>Produce one visitor-facing museum panel from a fully resolved seven-object selection. This brief contains every rule needed for the task; no prior case or external rule is required.</w:t>
       </w:r>
     </w:p>
     <w:p>
       <w:pPr>
         <w:pStyle w:val="Heading1"/>
+        <w:widowControl/>
       </w:pPr>
       <w:r>
-        <w:t>1. Resolve controlling records at the correct cutoff</w:t>
+        <w:t>1. Resolve controlling records</w:t>
       </w:r>
     </w:p>
     <w:p>
-      <w:pPr/>
+      <w:pPr>
+        <w:widowControl/>
+      </w:pPr>
       <w:r>
-        <w:t>For Curatorial Reviews, Interpretation Reviews, Loan and Insurance, Rights and Credits, Conservation Assessments, Rotation Approvals, and Placement Requests, ignore rows after 18 February 2027 at 4:00 PM.</w:t>
+        <w:t>Base cutoff applies to Curatorial Reviews, Interpretation Reviews, Loan and Insurance, Rights and Credits, Conservation Assessments, Rotation Approvals, and Placement Requests. Overlay cutoff applies to Coverage Directives, Community Commitments, Placement Overrides, Route Capacity Overrides, and Phase Definitions. Public Copy Freeze uses the latest row strictly before the freeze.</w:t>
       </w:r>
     </w:p>
     <w:p>
-      <w:pPr/>
+      <w:pPr>
+        <w:widowControl/>
+      </w:pPr>
       <w:r>
-        <w:t>For Coverage Directives, Community Commitments, Placement Overrides, Route Capacity Overrides, and Phase Definitions, ignore rows after 20 February 2027 at 5:00 PM.</w:t>
-      </w:r>
-    </w:p>
-    <w:p>
-      <w:pPr/>
-      <w:r>
-        <w:t>For Public Copy Freeze, ignore rows at or after 25 February 2027 at 12:00 PM; the latest row strictly before the freeze controls.</w:t>
-      </w:r>
-    </w:p>
-    <w:p>
-      <w:pPr/>
-      <w:r>
-        <w:t>Within each sheet and key, choose the latest permitted timestamp. When timestamps are equal, the larger revision_no controls. Use the controlling row as a whole; never combine fields from older revisions.</w:t>
-      </w:r>
-    </w:p>
-    <w:p>
-      <w:pPr/>
-      <w:r>
-        <w:t>An approved active placement override supersedes the controlling Placement Request for feasibility and public gallery/zone. An approved active route-capacity override supersedes only the matching gallery limits.</w:t>
+        <w:t>Within each sheet and entity key, choose the latest permitted timestamp. On a timestamp tie, choose the larger revision_no. Use the controlling row as a whole. Approved active placement overrides supersede Placement Requests. Approved active route overrides supersede only the matching gallery route limits.</w:t>
       </w:r>
     </w:p>
     <w:p>
       <w:pPr>
         <w:pStyle w:val="Heading1"/>
+        <w:widowControl/>
       </w:pPr>
       <w:r>
-        <w:t>2. Base individual eligibility and eligible ranking</w:t>
+        <w:t>2. Individual eligibility and ranking</w:t>
       </w:r>
     </w:p>
     <w:p>
+      <w:pPr>
+        <w:widowControl/>
+      </w:pPr>
       <w:r>
-        <w:t>Apply the same individual-eligibility tests used in the original case: active object; fully approved final curatorial, interpretation, loan, rights, conservation, rotation, and placement records; all score thresholds; feature-specific audio/transcript/tactile approvals; complete loan, insurance, and rights windows; completed treatment and mount; sufficient display days; and a compatible open zone.</w:t>
+        <w:t>An object is individually eligible only when all of the following are true:</w:t>
       </w:r>
     </w:p>
     <w:p>
+      <w:pPr>
+        <w:pStyle w:val="ListBullet"/>
+        <w:widowControl/>
+        <w:spacing w:after="10"/>
+        <w:ind w:left="317" w:hanging="173"/>
+      </w:pPr>
+      <w:r>
+        <w:t>Object Register: object_status is active.</w:t>
+      </w:r>
+    </w:p>
+    <w:p>
+      <w:pPr>
+        <w:pStyle w:val="ListBullet"/>
+        <w:widowControl/>
+        <w:spacing w:after="10"/>
+        <w:ind w:left="317" w:hanging="173"/>
+      </w:pPr>
+      <w:r>
+        <w:t>Curatorial Review: review_stage final; label_copy_status final; image_asset_status approved; research_packet_status complete; review_status approved; each of community_relevance, narrative_strength, provenance_confidence, visual_impact, and accessibility_value is at least 80.</w:t>
+      </w:r>
+    </w:p>
+    <w:p>
+      <w:pPr>
+        <w:pStyle w:val="ListBullet"/>
+        <w:widowControl/>
+        <w:spacing w:after="10"/>
+        <w:ind w:left="317" w:hanging="173"/>
+      </w:pPr>
+      <w:r>
+        <w:t>Interpretation Review: public_label_status final, alt_text_status approved, credit_line_status approved, and public_feature_status approved. Audio-stop objects also require audio_asset_status and transcript_status approved. Large-print-transcript objects require transcript_status approved. Tactile-replica objects require tactile_asset_status approved.</w:t>
+      </w:r>
+    </w:p>
+    <w:p>
+      <w:pPr>
+        <w:pStyle w:val="ListBullet"/>
+        <w:widowControl/>
+        <w:spacing w:after="10"/>
+        <w:ind w:left="317" w:hanging="173"/>
+      </w:pPr>
+      <w:r>
+        <w:t>Loan and Insurance: confirmed loan, signed agreement, active insurance, no lender restriction, and loan/insurance windows covering 25 February–15 August 2027.</w:t>
+      </w:r>
+    </w:p>
+    <w:p>
+      <w:pPr>
+        <w:pStyle w:val="ListBullet"/>
+        <w:widowControl/>
+        <w:spacing w:after="10"/>
+        <w:ind w:left="317" w:hanging="173"/>
+      </w:pPr>
+      <w:r>
+        <w:t>Rights and Credits: image rights cleared, scope gallery_and_promotion, approved credit line, and rights window covering 25 February–15 August 2027.</w:t>
+      </w:r>
+    </w:p>
+    <w:p>
+      <w:pPr>
+        <w:pStyle w:val="ListBullet"/>
+        <w:widowControl/>
+        <w:spacing w:after="10"/>
+        <w:ind w:left="317" w:hanging="173"/>
+      </w:pPr>
+      <w:r>
+        <w:t>Conservation: completed assessment, completed treatment, display approved, ready mount when required, and max_display_days at least the inclusive approved on-view duration.</w:t>
+      </w:r>
+    </w:p>
+    <w:p>
+      <w:pPr>
+        <w:pStyle w:val="ListBullet"/>
+        <w:widowControl/>
+        <w:spacing w:after="10"/>
+        <w:ind w:left="317" w:hanging="173"/>
+      </w:pPr>
+      <w:r>
+        <w:t>Rotation: approved and wholly inside 20 March–15 August 2027.</w:t>
+      </w:r>
+    </w:p>
+    <w:p>
+      <w:pPr>
+        <w:pStyle w:val="ListBullet"/>
+        <w:widowControl/>
+        <w:spacing w:after="10"/>
+        <w:ind w:left="317" w:hanging="173"/>
+      </w:pPr>
+      <w:r>
+        <w:t>Placement: ready; requested case type matches conservation/display requirements; zone is open and compatible with case type, dimensions, weight, lux, and humidity.</w:t>
+      </w:r>
+    </w:p>
+    <w:p>
+      <w:pPr>
+        <w:widowControl/>
+      </w:pPr>
       <w:r>
         <w:t>Curatorial score = 30% community relevance + 25% narrative strength + 20% provenance confidence + 15% visual impact + 10% accessibility value.</w:t>
       </w:r>
     </w:p>
     <w:p>
+      <w:pPr>
+        <w:widowControl/>
+      </w:pPr>
       <w:r>
-        <w:t>Rank individually eligible objects by: score descending; community relevance descending; installation crew-minutes (install_minutes × required_crew) ascending; accession number ascending.</w:t>
+        <w:t>Rank eligible objects by score descending, community relevance descending, installation crew-minutes ascending (install_minutes × required_crew), then accession number ascending.</w:t>
       </w:r>
     </w:p>
     <w:p>
       <w:pPr>
         <w:pStyle w:val="Heading1"/>
+        <w:widowControl/>
       </w:pPr>
       <w:r>
-        <w:t>3. Build and operationally validate the first seven</w:t>
+        <w:t>3. Build the provisional seven</w:t>
       </w:r>
     </w:p>
     <w:p>
+      <w:pPr>
+        <w:widowControl/>
+      </w:pPr>
       <w:r>
-        <w:t>Build the provisional seven exactly as before: take the highest-ranked eligible object for each of the five required themes, then scan the eligible ranking to fill seven while meeting the base collection, gallery, object-type, and accessibility rules.</w:t>
+        <w:t>Begin with the highest-ranked eligible object from each required theme: Waterfront Work, Transit and Movement, Flood and Resilience, Community Voice, and Markets and Exchange. Continue scanning the eligible ranking until seven objects are selected while maintaining all base portfolio constraints:</w:t>
       </w:r>
     </w:p>
     <w:p>
+      <w:pPr>
+        <w:pStyle w:val="ListBullet"/>
+        <w:widowControl/>
+        <w:spacing w:after="10"/>
+        <w:ind w:left="317" w:hanging="173"/>
+      </w:pPr>
       <w:r>
-        <w:t>Apply the four original feasibility reviews in order: zone slot counts; case inventory; confirmed installation crew-minute capacity; visitor-route feature/audio/tactile limits.</w:t>
-      </w:r>
-    </w:p>
-    <w:p>
-      <w:r>
-        <w:t>Use the established replacement rule after each conflict and continue until seven operationally feasible objects remain. Do not publish this intermediate set.</w:t>
+        <w:t>all five themes represented; no more than two objects from one collection; no more than two from one gallery; at least six distinct object types; at least two Audio stop, two Tactile replica, and two Large-print transcript objects; exactly five FULL objects and the approved DOC-A/DOC-B limited-run pair.</w:t>
       </w:r>
     </w:p>
     <w:p>
       <w:pPr>
         <w:pStyle w:val="Heading1"/>
+        <w:widowControl/>
       </w:pPr>
       <w:r>
-        <w:t>4. Apply the approved program overlay</w:t>
+        <w:t>4. Ordered operational feasibility</w:t>
       </w:r>
     </w:p>
     <w:p>
+      <w:pPr>
+        <w:widowControl/>
+      </w:pPr>
       <w:r>
-        <w:t>Resolve the controlling approved Coverage Directive. Its exact theme counts, collection/gallery caps, object-type minimum, accessibility totals, and full-run/limited-run totals are hard final-set constraints.</w:t>
+        <w:t>Review the provisional set in this order: (1) zone object-slot capacity, (2) available case inventory, (3) confirmed installation crew-minute capacity by gallery, (4) visitor-route maximum featured, audio, and tactile stops.</w:t>
       </w:r>
     </w:p>
     <w:p>
+      <w:pPr>
+        <w:widowControl/>
+      </w:pPr>
       <w:r>
-        <w:t>Resolve Community Commitments by accession. Every controlling commitment that is active, Tier A, approved_for_feature=yes, covers the full exhibition, and belongs to an individually eligible object is a mandatory program anchor.</w:t>
-      </w:r>
-    </w:p>
-    <w:p>
-      <w:r>
-        <w:t>Starting from the operational seven, insert missing mandatory anchors in eligible-rank order.</w:t>
-      </w:r>
-    </w:p>
-    <w:p>
-      <w:r>
-        <w:t>After each insertion, return the set to seven by removing the lowest-ranked non-mandatory object from a theme currently above its controlling target. If more than one such object is tied for removal, remove the one with greater crew-minutes, then the lexicographically larger accession number.</w:t>
-      </w:r>
-    </w:p>
-    <w:p>
-      <w:r>
-        <w:t>After all mandatory anchors are inserted, fill any theme deficit by scanning the eligible ranking. Recheck every directive constraint plus zone, case, crew, route, phase-visibility, and override feasibility after every change. Removed objects may not return.</w:t>
-      </w:r>
-    </w:p>
-    <w:p>
-      <w:r>
-        <w:t>The final set must contain exactly seven unique objects, five full-run objects, and the approved two-object rotation pair. Each approved phase must have exactly six selected objects physically on view.</w:t>
+        <w:t>When a review fails, remove the lowest-ranked object contributing to the conflict that can be removed without breaking a base portfolio constraint. If tied, remove the object with greater crew-minutes, then lexicographically larger accession number. Resume scanning the eligible ranking for the highest-ranked not-yet-used replacement that restores seven and satisfies all earlier reviews. Removed objects may not return. Continue through all four reviews. The resulting operational set is still not public.</w:t>
       </w:r>
     </w:p>
     <w:p>
       <w:pPr>
         <w:pStyle w:val="Heading1"/>
+        <w:widowControl/>
       </w:pPr>
       <w:r>
-        <w:t>5. Determine public priority and public fields</w:t>
+        <w:t>5. Approved program overlay</w:t>
       </w:r>
     </w:p>
     <w:p>
+      <w:pPr>
+        <w:widowControl/>
+      </w:pPr>
       <w:r>
-        <w:t>Number the final seven using the controlling Coverage Directive theme_order. Within each theme, use the controlling Public Copy Freeze within_theme_sequence. Do not number by eligible rank, provisional order, replacement order, or gallery route.</w:t>
+        <w:t>Use the controlling approved Coverage Directive. Its exact theme counts, collection/gallery caps, distinct-object-type minimum, frozen accessibility totals, and full-run/limited-run totals are hard final constraints.</w:t>
       </w:r>
     </w:p>
     <w:p>
+      <w:pPr>
+        <w:widowControl/>
+      </w:pPr>
       <w:r>
-        <w:t>Use public_title, public_credit_line, public_accessibility_label, and public_hook from the controlling approved Public Copy Freeze row. Do not substitute Object Register wording when frozen wording differs.</w:t>
+        <w:t>A Community Commitment is mandatory only if its controlling row is active, Tier A, mandatory_if_eligible, approved_for_feature yes, covers the full exhibition, and its object is individually eligible.</w:t>
       </w:r>
     </w:p>
     <w:p>
+      <w:pPr>
+        <w:widowControl/>
+      </w:pPr>
       <w:r>
-        <w:t>Use era/year and primary material from Object Register; story theme from Object Register; gallery and zone from the controlling approved placement override when one exists, otherwise from the controlling ready Placement Request; on-view range from the controlling approved Rotation Approval.</w:t>
+        <w:t>Insert missing mandatory anchors in eligible-rank order. After each insertion, return to seven by removing the lowest-ranked non-mandatory object from a theme currently above the controlling target. Tie-break by greater crew-minutes, then lexicographically larger accession number. Fill any theme deficit by scanning eligible rank. Recheck directive, zone, case, crew, route, override, and phase-visibility feasibility after every change. Removed objects may not return.</w:t>
+      </w:r>
+    </w:p>
+    <w:p>
+      <w:pPr>
+        <w:widowControl/>
+      </w:pPr>
+      <w:r>
+        <w:t>The final set must contain seven unique objects, five full-run objects, the DOC-A/DOC-B pair, and exactly six visible objects in each approved phase.</w:t>
       </w:r>
     </w:p>
     <w:p>
       <w:pPr>
         <w:pStyle w:val="Heading1"/>
+        <w:widowControl/>
       </w:pPr>
       <w:r>
-        <w:t>6. Required public panel</w:t>
-      </w:r>
-    </w:p>
-    <w:p>
-      <w:r>
-        <w:t>Create one 1200 × 1600 portrait museum feature panel with the exact title “Working Waterfront: Featured Objects”, subtitle “Spring 2027 Community History Exhibition”, and exhibition dates “March 20–August 15, 2027”.</w:t>
-      </w:r>
-    </w:p>
-    <w:p>
-      <w:r>
-        <w:t>For each final object, publish:</w:t>
+        <w:t>6. Public order and public fields</w:t>
       </w:r>
     </w:p>
     <w:p>
       <w:pPr>
-        <w:pStyle w:val="ListBullet"/>
+        <w:widowControl/>
       </w:pPr>
       <w:r>
-        <w:t>public priority number and frozen public title;</w:t>
+        <w:t>Order the final seven by the controlling Coverage Directive theme_order, then by controlling Public Copy Freeze within_theme_sequence. Do not use eligible rank, provisional order, replacement order, or route order.</w:t>
       </w:r>
     </w:p>
     <w:p>
       <w:pPr>
-        <w:pStyle w:val="ListBullet"/>
+        <w:widowControl/>
       </w:pPr>
       <w:r>
-        <w:t>accession number;</w:t>
-      </w:r>
-    </w:p>
-    <w:p>
-      <w:pPr>
-        <w:pStyle w:val="ListBullet"/>
-      </w:pPr>
-      <w:r>
-        <w:t>era/year and every named primary material;</w:t>
-      </w:r>
-    </w:p>
-    <w:p>
-      <w:pPr>
-        <w:pStyle w:val="ListBullet"/>
-      </w:pPr>
-      <w:r>
-        <w:t>controlling public gallery and zone ID;</w:t>
-      </w:r>
-    </w:p>
-    <w:p>
-      <w:pPr>
-        <w:pStyle w:val="ListBullet"/>
-      </w:pPr>
-      <w:r>
-        <w:t>story theme;</w:t>
-      </w:r>
-    </w:p>
-    <w:p>
-      <w:pPr>
-        <w:pStyle w:val="ListBullet"/>
-      </w:pPr>
-      <w:r>
-        <w:t>frozen public credit line;</w:t>
-      </w:r>
-    </w:p>
-    <w:p>
-      <w:pPr>
-        <w:pStyle w:val="ListBullet"/>
-      </w:pPr>
-      <w:r>
-        <w:t>exact approved on-view range;</w:t>
-      </w:r>
-    </w:p>
-    <w:p>
-      <w:pPr>
-        <w:pStyle w:val="ListBullet"/>
-      </w:pPr>
-      <w:r>
-        <w:t>frozen public accessibility label;</w:t>
-      </w:r>
-    </w:p>
-    <w:p>
-      <w:pPr>
-        <w:pStyle w:val="ListBullet"/>
-      </w:pPr>
-      <w:r>
-        <w:t>frozen concise public hook.</w:t>
+        <w:t>Use the controlling frozen public_title, public_accessibility_label, and public_hook. Use accession and year from Object Register, gallery and zone from an approved active placement override when present or otherwise the ready Placement Request, and on-view range from the approved Rotation Approval.</w:t>
       </w:r>
     </w:p>
     <w:p>
       <w:pPr>
         <w:pStyle w:val="Heading1"/>
+        <w:widowControl/>
       </w:pPr>
       <w:r>
-        <w:t>7. Required public summaries</w:t>
+        <w:t>7. Required panel content</w:t>
       </w:r>
     </w:p>
     <w:p>
+      <w:pPr>
+        <w:widowControl/>
+      </w:pPr>
       <w:r>
-        <w:t>Plan Your Visit — Opening rotation: list the five official galleries in route order, the selected objects visible from March 20 through May 31, and each gallery’s visible-object count.</w:t>
+        <w:t>Create a portrait panel, preferably 1400 × 2200 pixels or larger, with exact title, subtitle, and dates. For each final object publish priority/title, accession/year, gallery/zone, on-view range, frozen accessibility label, and frozen concise hook.</w:t>
       </w:r>
     </w:p>
     <w:p>
+      <w:pPr>
+        <w:widowControl/>
+      </w:pPr>
       <w:r>
-        <w:t>Plan Your Visit — Closing rotation: repeat for June 1 through August 15.</w:t>
-      </w:r>
-    </w:p>
-    <w:p>
-      <w:r>
-        <w:t>Rotation Notice: name the two limited-run objects, show both exact date ranges, and calculate inclusive days by counting both endpoints.</w:t>
-      </w:r>
-    </w:p>
-    <w:p>
-      <w:r>
-        <w:t>Selection Snapshot: show seven unique featured objects; six objects visible in each phase; gallery count; exact theme distribution; collection distribution; distinct object-type count; earliest and latest years and numeric span; frozen accessibility-label counts; and full-run versus limited-run counts.</w:t>
+        <w:t>Opening and Closing Plan Your Visit sections must list all five official galleries in route order, each visible selected-object set, and each visible count. Rotation Notice must show both limited-run objects, exact ranges, and inclusive days. Selection Snapshot must show: seven unique objects; six visible in each phase; exact theme distribution; frozen accessibility totals; five full-run and two limited-run.</w:t>
       </w:r>
     </w:p>
     <w:p>
       <w:pPr>
         <w:pStyle w:val="Heading1"/>
+        <w:widowControl/>
       </w:pPr>
       <w:r>
-        <w:t>8. Publication exclusions</w:t>
-      </w:r>
-    </w:p>
-    <w:p>
-      <w:r>
-        <w:t>Do not publish component scores, eligibility failures, operational intermediate selections, commitment tiers, resource conflicts, crew calculations, route-capacity changes, placement-override reasons, replacement reasons, or record cutoffs. No unselected object may receive featured, route, rotation, recommendation, or equivalent public status.</w:t>
+        <w:t>8. Exclusions</w:t>
       </w:r>
     </w:p>
     <w:p>
       <w:pPr>
-        <w:pStyle w:val="Heading1"/>
+        <w:widowControl/>
       </w:pPr>
       <w:r>
-        <w:t>Appendix: field authority</w:t>
+        <w:t>Do not publish scores, eligibility failures, intermediate selections, tiers, conflicts, crew calculations, override reasons, replacement reasons, or cutoffs. No unselected object may receive featured, route, rotation, recommendation, or equivalent public status.</w:t>
       </w:r>
     </w:p>
-    <w:tbl>
-      <w:tblPr>
-        <w:tblStyle w:val="TableGrid"/>
-        <w:tblW w:type="auto" w:w="0"/>
-        <w:jc w:val="center"/>
-        <w:tblLook w:firstColumn="1" w:firstRow="1" w:lastColumn="0" w:lastRow="0" w:noHBand="0" w:noVBand="1" w:val="04A0"/>
-      </w:tblPr>
-      <w:tblGrid>
-        <w:gridCol w:w="3408"/>
-        <w:gridCol w:w="3408"/>
-        <w:gridCol w:w="3408"/>
-      </w:tblGrid>
-      <w:tr>
-        <w:tc>
-          <w:tcPr>
-            <w:tcW w:type="dxa" w:w="3408"/>
-            <w:vAlign w:val="top"/>
-          </w:tcPr>
-          <w:p>
-            <w:pPr>
-              <w:spacing w:after="20"/>
-            </w:pPr>
-            <w:r>
-              <w:t>Public field</w:t>
-            </w:r>
-          </w:p>
-        </w:tc>
-        <w:tc>
-          <w:tcPr>
-            <w:tcW w:type="dxa" w:w="3408"/>
-            <w:vAlign w:val="top"/>
-          </w:tcPr>
-          <w:p>
-            <w:pPr>
-              <w:spacing w:after="20"/>
-            </w:pPr>
-            <w:r>
-              <w:t>Controlling source</w:t>
-            </w:r>
-          </w:p>
-        </w:tc>
-        <w:tc>
-          <w:tcPr>
-            <w:tcW w:type="dxa" w:w="3408"/>
-            <w:vAlign w:val="top"/>
-          </w:tcPr>
-          <w:p>
-            <w:pPr>
-              <w:spacing w:after="20"/>
-            </w:pPr>
-            <w:r>
-              <w:t>Important rule</w:t>
-            </w:r>
-          </w:p>
-        </w:tc>
-      </w:tr>
-      <w:tr>
-        <w:tc>
-          <w:tcPr>
-            <w:tcW w:type="dxa" w:w="3408"/>
-            <w:vAlign w:val="top"/>
-          </w:tcPr>
-          <w:p>
-            <w:pPr>
-              <w:spacing w:after="20"/>
-            </w:pPr>
-            <w:r>
-              <w:t>Final set</w:t>
-            </w:r>
-          </w:p>
-        </w:tc>
-        <w:tc>
-          <w:tcPr>
-            <w:tcW w:type="dxa" w:w="3408"/>
-            <w:vAlign w:val="top"/>
-          </w:tcPr>
-          <w:p>
-            <w:pPr>
-              <w:spacing w:after="20"/>
-            </w:pPr>
-            <w:r>
-              <w:t>All original workbooks + approved program overlay</w:t>
-            </w:r>
-          </w:p>
-        </w:tc>
-        <w:tc>
-          <w:tcPr>
-            <w:tcW w:type="dxa" w:w="3408"/>
-            <w:vAlign w:val="top"/>
-          </w:tcPr>
-          <w:p>
-            <w:pPr>
-              <w:spacing w:after="20"/>
-            </w:pPr>
-            <w:r>
-              <w:t>Do not stop at the operational seven.</w:t>
-            </w:r>
-          </w:p>
-        </w:tc>
-      </w:tr>
-      <w:tr>
-        <w:tc>
-          <w:tcPr>
-            <w:tcW w:type="dxa" w:w="3408"/>
-            <w:vAlign w:val="top"/>
-          </w:tcPr>
-          <w:p>
-            <w:pPr>
-              <w:spacing w:after="20"/>
-            </w:pPr>
-            <w:r>
-              <w:t>Priority/order</w:t>
-            </w:r>
-          </w:p>
-        </w:tc>
-        <w:tc>
-          <w:tcPr>
-            <w:tcW w:type="dxa" w:w="3408"/>
-            <w:vAlign w:val="top"/>
-          </w:tcPr>
-          <w:p>
-            <w:pPr>
-              <w:spacing w:after="20"/>
-            </w:pPr>
-            <w:r>
-              <w:t>Coverage Directives + Public Copy Freeze</w:t>
-            </w:r>
-          </w:p>
-        </w:tc>
-        <w:tc>
-          <w:tcPr>
-            <w:tcW w:type="dxa" w:w="3408"/>
-            <w:vAlign w:val="top"/>
-          </w:tcPr>
-          <w:p>
-            <w:pPr>
-              <w:spacing w:after="20"/>
-            </w:pPr>
-            <w:r>
-              <w:t>Theme order, then within-theme sequence.</w:t>
-            </w:r>
-          </w:p>
-        </w:tc>
-      </w:tr>
-      <w:tr>
-        <w:tc>
-          <w:tcPr>
-            <w:tcW w:type="dxa" w:w="3408"/>
-            <w:vAlign w:val="top"/>
-          </w:tcPr>
-          <w:p>
-            <w:pPr>
-              <w:spacing w:after="20"/>
-            </w:pPr>
-            <w:r>
-              <w:t>Public title</w:t>
-            </w:r>
-          </w:p>
-        </w:tc>
-        <w:tc>
-          <w:tcPr>
-            <w:tcW w:type="dxa" w:w="3408"/>
-            <w:vAlign w:val="top"/>
-          </w:tcPr>
-          <w:p>
-            <w:pPr>
-              <w:spacing w:after="20"/>
-            </w:pPr>
-            <w:r>
-              <w:t>Public Copy Freeze</w:t>
-            </w:r>
-          </w:p>
-        </w:tc>
-        <w:tc>
-          <w:tcPr>
-            <w:tcW w:type="dxa" w:w="3408"/>
-            <w:vAlign w:val="top"/>
-          </w:tcPr>
-          <w:p>
-            <w:pPr>
-              <w:spacing w:after="20"/>
-            </w:pPr>
-            <w:r>
-              <w:t>Use frozen wording exactly.</w:t>
-            </w:r>
-          </w:p>
-        </w:tc>
-      </w:tr>
-      <w:tr>
-        <w:tc>
-          <w:tcPr>
-            <w:tcW w:type="dxa" w:w="3408"/>
-            <w:vAlign w:val="top"/>
-          </w:tcPr>
-          <w:p>
-            <w:pPr>
-              <w:spacing w:after="20"/>
-            </w:pPr>
-            <w:r>
-              <w:t>Credit</w:t>
-            </w:r>
-          </w:p>
-        </w:tc>
-        <w:tc>
-          <w:tcPr>
-            <w:tcW w:type="dxa" w:w="3408"/>
-            <w:vAlign w:val="top"/>
-          </w:tcPr>
-          <w:p>
-            <w:pPr>
-              <w:spacing w:after="20"/>
-            </w:pPr>
-            <w:r>
-              <w:t>Public Copy Freeze</w:t>
-            </w:r>
-          </w:p>
-        </w:tc>
-        <w:tc>
-          <w:tcPr>
-            <w:tcW w:type="dxa" w:w="3408"/>
-            <w:vAlign w:val="top"/>
-          </w:tcPr>
-          <w:p>
-            <w:pPr>
-              <w:spacing w:after="20"/>
-            </w:pPr>
-            <w:r>
-              <w:t>Use frozen approved line, not an older register line.</w:t>
-            </w:r>
-          </w:p>
-        </w:tc>
-      </w:tr>
-      <w:tr>
-        <w:tc>
-          <w:tcPr>
-            <w:tcW w:type="dxa" w:w="3408"/>
-            <w:vAlign w:val="top"/>
-          </w:tcPr>
-          <w:p>
-            <w:pPr>
-              <w:spacing w:after="20"/>
-            </w:pPr>
-            <w:r>
-              <w:t>Accessibility label</w:t>
-            </w:r>
-          </w:p>
-        </w:tc>
-        <w:tc>
-          <w:tcPr>
-            <w:tcW w:type="dxa" w:w="3408"/>
-            <w:vAlign w:val="top"/>
-          </w:tcPr>
-          <w:p>
-            <w:pPr>
-              <w:spacing w:after="20"/>
-            </w:pPr>
-            <w:r>
-              <w:t>Public Copy Freeze</w:t>
-            </w:r>
-          </w:p>
-        </w:tc>
-        <w:tc>
-          <w:tcPr>
-            <w:tcW w:type="dxa" w:w="3408"/>
-            <w:vAlign w:val="top"/>
-          </w:tcPr>
-          <w:p>
-            <w:pPr>
-              <w:spacing w:after="20"/>
-            </w:pPr>
-            <w:r>
-              <w:t>Use public label such as Audio story, Touch replica, or Large-print copy.</w:t>
-            </w:r>
-          </w:p>
-        </w:tc>
-      </w:tr>
-      <w:tr>
-        <w:tc>
-          <w:tcPr>
-            <w:tcW w:type="dxa" w:w="3408"/>
-            <w:vAlign w:val="top"/>
-          </w:tcPr>
-          <w:p>
-            <w:pPr>
-              <w:spacing w:after="20"/>
-            </w:pPr>
-            <w:r>
-              <w:t>Gallery/zone</w:t>
-            </w:r>
-          </w:p>
-        </w:tc>
-        <w:tc>
-          <w:tcPr>
-            <w:tcW w:type="dxa" w:w="3408"/>
-            <w:vAlign w:val="top"/>
-          </w:tcPr>
-          <w:p>
-            <w:pPr>
-              <w:spacing w:after="20"/>
-            </w:pPr>
-            <w:r>
-              <w:t>Placement Override or Placement Request</w:t>
-            </w:r>
-          </w:p>
-        </w:tc>
-        <w:tc>
-          <w:tcPr>
-            <w:tcW w:type="dxa" w:w="3408"/>
-            <w:vAlign w:val="top"/>
-          </w:tcPr>
-          <w:p>
-            <w:pPr>
-              <w:spacing w:after="20"/>
-            </w:pPr>
-            <w:r>
-              <w:t>Approved active override has precedence.</w:t>
-            </w:r>
-          </w:p>
-        </w:tc>
-      </w:tr>
-      <w:tr>
-        <w:tc>
-          <w:tcPr>
-            <w:tcW w:type="dxa" w:w="3408"/>
-            <w:vAlign w:val="top"/>
-          </w:tcPr>
-          <w:p>
-            <w:pPr>
-              <w:spacing w:after="20"/>
-            </w:pPr>
-            <w:r>
-              <w:t>On-view range</w:t>
-            </w:r>
-          </w:p>
-        </w:tc>
-        <w:tc>
-          <w:tcPr>
-            <w:tcW w:type="dxa" w:w="3408"/>
-            <w:vAlign w:val="top"/>
-          </w:tcPr>
-          <w:p>
-            <w:pPr>
-              <w:spacing w:after="20"/>
-            </w:pPr>
-            <w:r>
-              <w:t>Rotation Approvals</w:t>
-            </w:r>
-          </w:p>
-        </w:tc>
-        <w:tc>
-          <w:tcPr>
-            <w:tcW w:type="dxa" w:w="3408"/>
-            <w:vAlign w:val="top"/>
-          </w:tcPr>
-          <w:p>
-            <w:pPr>
-              <w:spacing w:after="20"/>
-            </w:pPr>
-            <w:r>
-              <w:t>Never assume full exhibition dates.</w:t>
-            </w:r>
-          </w:p>
-        </w:tc>
-      </w:tr>
-      <w:tr>
-        <w:tc>
-          <w:tcPr>
-            <w:tcW w:type="dxa" w:w="3408"/>
-            <w:vAlign w:val="top"/>
-          </w:tcPr>
-          <w:p>
-            <w:pPr>
-              <w:spacing w:after="20"/>
-            </w:pPr>
-            <w:r>
-              <w:t>Phase route</w:t>
-            </w:r>
-          </w:p>
-        </w:tc>
-        <w:tc>
-          <w:tcPr>
-            <w:tcW w:type="dxa" w:w="3408"/>
-            <w:vAlign w:val="top"/>
-          </w:tcPr>
-          <w:p>
-            <w:pPr>
-              <w:spacing w:after="20"/>
-            </w:pPr>
-            <w:r>
-              <w:t>Phase Definitions + Visitor Route Plan</w:t>
-            </w:r>
-          </w:p>
-        </w:tc>
-        <w:tc>
-          <w:tcPr>
-            <w:tcW w:type="dxa" w:w="3408"/>
-            <w:vAlign w:val="top"/>
-          </w:tcPr>
-          <w:p>
-            <w:pPr>
-              <w:spacing w:after="20"/>
-            </w:pPr>
-            <w:r>
-              <w:t>List only objects visible during that phase.</w:t>
-            </w:r>
-          </w:p>
-        </w:tc>
-      </w:tr>
-      <w:tr>
-        <w:tc>
-          <w:tcPr>
-            <w:tcW w:type="dxa" w:w="3408"/>
-            <w:vAlign w:val="top"/>
-          </w:tcPr>
-          <w:p>
-            <w:pPr>
-              <w:spacing w:after="20"/>
-            </w:pPr>
-            <w:r>
-              <w:t>Inclusive days</w:t>
-            </w:r>
-          </w:p>
-        </w:tc>
-        <w:tc>
-          <w:tcPr>
-            <w:tcW w:type="dxa" w:w="3408"/>
-            <w:vAlign w:val="top"/>
-          </w:tcPr>
-          <w:p>
-            <w:pPr>
-              <w:spacing w:after="20"/>
-            </w:pPr>
-            <w:r>
-              <w:t>Derived from approved dates</w:t>
-            </w:r>
-          </w:p>
-        </w:tc>
-        <w:tc>
-          <w:tcPr>
-            <w:tcW w:type="dxa" w:w="3408"/>
-            <w:vAlign w:val="top"/>
-          </w:tcPr>
-          <w:p>
-            <w:pPr>
-              <w:spacing w:after="20"/>
-            </w:pPr>
-            <w:r>
-              <w:t>Count both start and end dates.</w:t>
-            </w:r>
-          </w:p>
-        </w:tc>
-      </w:tr>
-    </w:tbl>
     <w:sectPr>
       <w:pgSz w:w="12240" w:h="15840"/>
-      <w:pgMar w:top="936" w:right="1008" w:bottom="936" w:left="1008" w:header="720" w:footer="720" w:gutter="0"/>
+      <w:pgMar w:top="720" w:right="893" w:bottom="720" w:left="893" w:header="720" w:footer="720" w:gutter="0"/>
       <w:cols w:space="720"/>
       <w:docGrid w:linePitch="360"/>
     </w:sectPr>
@@ -1159,9 +747,12 @@
     <w:name w:val="Normal"/>
     <w:qFormat/>
     <w:rsid w:val="00FC693F"/>
+    <w:pPr>
+      <w:spacing w:after="40" w:line="240" w:lineRule="auto"/>
+    </w:pPr>
     <w:rPr>
       <w:rFonts w:ascii="Arial" w:hAnsi="Arial"/>
-      <w:sz w:val="19"/>
+      <w:sz w:val="17"/>
     </w:rPr>
   </w:style>
   <w:style w:type="paragraph" w:styleId="Header">
@@ -1219,14 +810,15 @@
     <w:pPr>
       <w:keepNext/>
       <w:keepLines/>
-      <w:spacing w:before="480" w:after="0"/>
+      <w:spacing w:before="140" w:after="40"/>
       <w:outlineLvl w:val="0"/>
     </w:pPr>
     <w:rPr>
       <w:rFonts w:asciiTheme="majorHAnsi" w:eastAsiaTheme="majorEastAsia" w:hAnsiTheme="majorHAnsi" w:cstheme="majorBidi" w:ascii="Arial" w:hAnsi="Arial"/>
       <w:b/>
       <w:bCs/>
-      <w:sz w:val="28"/>
+      <w:color w:val="365F91" w:themeColor="accent1" w:themeShade="BF"/>
+      <w:sz w:val="25"/>
       <w:szCs w:val="28"/>
     </w:rPr>
   </w:style>
@@ -1246,9 +838,10 @@
       <w:outlineLvl w:val="1"/>
     </w:pPr>
     <w:rPr>
-      <w:rFonts w:asciiTheme="majorHAnsi" w:eastAsiaTheme="majorEastAsia" w:hAnsiTheme="majorHAnsi" w:cstheme="majorBidi" w:ascii="Arial" w:hAnsi="Arial"/>
+      <w:rFonts w:asciiTheme="majorHAnsi" w:eastAsiaTheme="majorEastAsia" w:hAnsiTheme="majorHAnsi" w:cstheme="majorBidi"/>
       <w:b/>
       <w:bCs/>
+      <w:color w:val="4F81BD" w:themeColor="accent1"/>
       <w:sz w:val="26"/>
       <w:szCs w:val="26"/>
     </w:rPr>
@@ -1506,7 +1099,7 @@
       <w:pBdr>
         <w:bottom w:val="single" w:sz="8" w:space="4" w:color="4F81BD" w:themeColor="accent1"/>
       </w:pBdr>
-      <w:spacing w:after="300" w:line="240" w:lineRule="auto"/>
+      <w:spacing w:after="80" w:line="240" w:lineRule="auto"/>
       <w:contextualSpacing/>
     </w:pPr>
     <w:rPr>
@@ -1515,7 +1108,7 @@
       <w:color w:val="17365D" w:themeColor="text2" w:themeShade="BF"/>
       <w:spacing w:val="5"/>
       <w:kern w:val="28"/>
-      <w:sz w:val="48"/>
+      <w:sz w:val="36"/>
       <w:szCs w:val="52"/>
     </w:rPr>
   </w:style>

</xml_diff>